<commit_message>
Updateoing test case documents
</commit_message>
<xml_diff>
--- a/Unit_Testcase_details.docx
+++ b/Unit_Testcase_details.docx
@@ -4,23 +4,43 @@
   <w:body>
     <w:p>
       <w:r>
-        <w:t xml:space="preserve">Absolutely, let’s break down the </w:t>
-      </w:r>
-      <w:r>
-        <w:rPr>
-          <w:b/>
-          <w:bCs/>
-        </w:rPr>
-        <w:t>unit test</w:t>
-      </w:r>
-      <w:r>
-        <w:t xml:space="preserve"> I drafted for your function step by step so it’s crystal clear:</w:t>
-      </w:r>
-    </w:p>
+        <w:t xml:space="preserve">How to run test cases  </w:t>
+      </w:r>
+    </w:p>
+    <w:p>
+      <w:r>
+        <w:t xml:space="preserve">Use below on terminal  on   vs code terminal   </w:t>
+      </w:r>
+    </w:p>
+    <w:p>
+      <w:proofErr w:type="spellStart"/>
+      <w:r>
+        <w:t>pytest</w:t>
+      </w:r>
+      <w:proofErr w:type="spellEnd"/>
+      <w:r>
+        <w:t xml:space="preserve"> test_file_tool.py</w:t>
+      </w:r>
+    </w:p>
+    <w:p/>
+    <w:p>
+      <w:r>
+        <w:t>(.</w:t>
+      </w:r>
+      <w:proofErr w:type="spellStart"/>
+      <w:r>
+        <w:t>venv</w:t>
+      </w:r>
+      <w:proofErr w:type="spellEnd"/>
+      <w:r>
+        <w:t>) PS C:\HarishKemkar\local_repo\Automation_old_file_mover&gt;</w:t>
+      </w:r>
+    </w:p>
+    <w:p/>
     <w:p>
       <w:r>
         <w:pict w14:anchorId="3F13318D">
-          <v:rect id="_x0000_i1049" style="width:0;height:1.5pt" o:hralign="center" o:hrstd="t" o:hr="t" fillcolor="#a0a0a0" stroked="f"/>
+          <v:rect id="_x0000_i1025" style="width:0;height:1.5pt" o:hralign="center" o:hrstd="t" o:hr="t" fillcolor="#a0a0a0" stroked="f"/>
         </w:pict>
       </w:r>
     </w:p>
@@ -235,7 +255,7 @@
     <w:p>
       <w:r>
         <w:pict w14:anchorId="5E60CE81">
-          <v:rect id="_x0000_i1050" style="width:0;height:1.5pt" o:hralign="center" o:hrstd="t" o:hr="t" fillcolor="#a0a0a0" stroked="f"/>
+          <v:rect id="_x0000_i1026" style="width:0;height:1.5pt" o:hralign="center" o:hrstd="t" o:hr="t" fillcolor="#a0a0a0" stroked="f"/>
         </w:pict>
       </w:r>
     </w:p>
@@ -638,7 +658,7 @@
     <w:p>
       <w:r>
         <w:pict w14:anchorId="42DF145D">
-          <v:rect id="_x0000_i1051" style="width:0;height:1.5pt" o:hralign="center" o:hrstd="t" o:hr="t" fillcolor="#a0a0a0" stroked="f"/>
+          <v:rect id="_x0000_i1027" style="width:0;height:1.5pt" o:hralign="center" o:hrstd="t" o:hr="t" fillcolor="#a0a0a0" stroked="f"/>
         </w:pict>
       </w:r>
     </w:p>
@@ -719,7 +739,7 @@
     <w:p>
       <w:r>
         <w:pict w14:anchorId="031D040A">
-          <v:rect id="_x0000_i1052" style="width:0;height:1.5pt" o:hralign="center" o:hrstd="t" o:hr="t" fillcolor="#a0a0a0" stroked="f"/>
+          <v:rect id="_x0000_i1028" style="width:0;height:1.5pt" o:hralign="center" o:hrstd="t" o:hr="t" fillcolor="#a0a0a0" stroked="f"/>
         </w:pict>
       </w:r>
     </w:p>
@@ -1856,6 +1876,7 @@
   <w:style w:type="character" w:default="1" w:styleId="DefaultParagraphFont">
     <w:name w:val="Default Paragraph Font"/>
     <w:uiPriority w:val="1"/>
+    <w:semiHidden/>
     <w:unhideWhenUsed/>
   </w:style>
   <w:style w:type="table" w:default="1" w:styleId="TableNormal">

</xml_diff>